<commit_message>
Refactor introduction and results sections for clarity and conciseness
</commit_message>
<xml_diff>
--- a/informe_microproyecto1.docx
+++ b/informe_microproyecto1.docx
@@ -467,7 +467,7 @@
         <w:rPr>
           <w:lang w:val="es-ES"/>
         </w:rPr>
-        <w:t>La resonancia magnética (MRI) es una de las principales herramientas para detectar y clasificar tumores cerebrales. El tipo de tumor orienta el tratamiento y el pronóstico, y hoy lo determina un radiólogo que revisa los cortes uno a uno, un trabajo lento cuyo resultado puede variar entre evaluadores. Este trabajo aborda la clasificación automática de cortes 2D de MRI cerebral en cuatro clases: glioma, meningioma, tumor pituitario y tejido sano. Usar cortes individuales en lugar del volumen 3D reduce el costo de cómputo y convierte la tarea en un problema de clasificación de imágenes.</w:t>
+        <w:t>La resonancia magnética (MRI) es una de las principales herramientas para detectar y clasificar tumores cerebrales. El tipo de tumor orienta el tratamiento y el pronóstico, y hoy lo determina un radiólogo que revisa los cortes uno a uno, un trabajo lento cuyo resultado puede variar entre evaluadores. Este trabajo aborda la clasificación automática de cortes 2D de MRI cerebral en cuatro clases: glioma, meningioma, tumor pituitario y tejido sano. Usar cortes individuales en lugar del volumen 3D reduce el costo de cómputo.</w:t>
       </w:r>
     </w:p>
     <w:p>
@@ -478,7 +478,7 @@
         <w:rPr>
           <w:lang w:val="es-ES"/>
         </w:rPr>
-        <w:t>Las redes neuronales convolucionales (CNN) aprenden directamente de los píxeles los filtros que antes se diseñaban a mano. Las conexiones residuales de ResNet permiten entrenar redes profundas, y los filtros que estas aprenden en ImageNet sirven como punto de partida en otros dominios. En imagen médica, donde los datos etiquetados son escasos, este ajuste fino (</w:t>
+        <w:t>Las redes neuronales convolucionales (CNN) aprenden directamente de los píxeles los filtros que antes se diseñaban a mano, y los que aprenden redes profundas como ResNet en ImageNet sirven como punto de partida en otros dominios. En imagen médica, donde los datos etiquetados son escasos, este ajuste fino (</w:t>
       </w:r>
       <w:r>
         <w:rPr>
@@ -604,7 +604,7 @@
         <w:rPr>
           <w:lang w:val="es-ES"/>
         </w:rPr>
-        <w:t>, SARTAJ y Br35H, de donde provienen las imágenes sanas. Al comparar el hash MD5 de los archivos aparecieron 426 copias exactas (294 en la clase sana y 114 en meningioma), que se eliminaron; quedaron 6597 imágenes. Sin este paso, el 7,1 % de las imágenes de prueba tendría una copia idéntica en entrenamiento, una fuga de datos que infla la métrica de prueba. Cada imagen se convirtió a escala de grises, se redimensionó a 128×128 píxeles y se normalizó al rango [0, 1]. La división es estratificada y con semilla fija: 70 % para entrenamiento (4617), 15 % para validación (990) y 15 % para prueba (990). Como aumento de datos, en cada lote se volteó horizontalmente la mitad de las imágenes, ya que el tumor puede estar en cualquiera de los dos hemisferios.</w:t>
+        <w:t>, SARTAJ y Br35H, de donde provienen las imágenes sanas. Al comparar el hash MD5 de los archivos aparecieron 426 copias exactas, casi todas sanas o de meningioma, que se eliminaron; quedaron 6597 imágenes. Sin este paso, el 7,1 % de las imágenes de prueba tendría una copia idéntica en entrenamiento, una fuga de datos que infla la métrica de prueba. Cada imagen se convirtió a escala de grises, se redimensionó a 128×128 píxeles y se normalizó al rango [0, 1]. La división es estratificada y con semilla fija: 70 % para entrenamiento (4617), 15 % para validación (990) y 15 % para prueba (990). Como aumento de datos, en cada lote se volteó horizontalmente la mitad de las imágenes, ya que el tumor puede estar en cualquiera de los dos hemisferios.</w:t>
       </w:r>
     </w:p>
     <w:p>
@@ -641,7 +641,7 @@
         <w:rPr>
           <w:lang w:val="es-ES"/>
         </w:rPr>
-        <w:t xml:space="preserve"> de 0,5, y la capa de salida de 4 neuronas (1,15 M de parámetros). El segundo modelo es una ResNet18 preentrenada en ImageNet, con la capa final cambiada por una de 4 salidas (11,2 M de parámetros). Como ResNet espera imágenes RGB, el corte en gris se repite en los tres canales y se normaliza con la media y la desviación de ImageNet. Todos sus pesos se ajustan durante el entrenamiento.</w:t>
+        <w:t xml:space="preserve"> de 0,5, y la capa de salida de 4 neuronas (1,15 M de parámetros). El segundo modelo es una ResNet18 preentrenada en ImageNet, con la capa final cambiada por una de 4 salidas (11,18 M de parámetros). Como ResNet espera imágenes RGB, el corte en gris se repite en los tres canales y se normaliza con la media y la desviación de ImageNet. Todos sus pesos se ajustan durante el entrenamiento.</w:t>
       </w:r>
     </w:p>
     <w:p>
@@ -678,7 +678,7 @@
         <w:rPr>
           <w:lang w:val="es-ES"/>
         </w:rPr>
-        <w:t>, para no borrar lo aprendido en ImageNet, durante 6 épocas, porque parte de filtros ya entrenados y converge antes. Al final de cada época se mide la exactitud en validación y se conservan los pesos de la mejor época. Cada configuración se entrena con tres semillas (0, 1 y 2), que cambian la inicialización y el orden de los lotes pero no la división de datos. Todo se ejecutó en CPU (AMD Ryzen 7 5700) con PyTorch 2.14.</w:t>
+        <w:t>, para no borrar lo aprendido en ImageNet, durante 6 épocas. Al final de cada época se mide la exactitud en validación y se conservan los pesos de la mejor época. Cada configuración se entrena con tres semillas (0, 1 y 2), que cambian la inicialización y el orden de los lotes pero no la división de datos. Todo se ejecutó en CPU (AMD Ryzen 7 5700) con PyTorch 2.14.</w:t>
       </w:r>
     </w:p>
     <w:p>
@@ -739,7 +739,18 @@
         <w:rPr>
           <w:lang w:val="es-ES"/>
         </w:rPr>
-        <w:t>[Pendiente: se completa con las métricas finales cuando termine el entrenamiento.]</w:t>
+        <w:t>Según la Tabla 1, ResNet18 obtuvo una exactitud de 98,2 ± 0,4 % frente a 93,9 ± 0,3 % de la CNN propia. La diferencia de 4,3 puntos es más de diez veces la desviación entre semillas, así que no depende de la inicialización. La mejora es mayor en glioma (97,9 % de sensibilidad frente a 87,2 %), la clase más inestable de la CNN propia.</w:t>
+      </w:r>
+    </w:p>
+    <w:p>
+      <w:pPr>
+        <w:pStyle w:val="Text"/>
+      </w:pPr>
+      <w:r>
+        <w:rPr>
+          <w:lang w:val="es-ES"/>
+        </w:rPr>
+        <w:t>En la Fig. 1, ResNet18 alcanza su mejor exactitud de validación en la época 4 en las tres semillas; después, su pérdida de validación deja de bajar mientras la de entrenamiento sigue cayendo. La CNN propia avanza más despacio, su exactitud de validación oscila hasta 5 puntos entre épocas y en dos semillas su mejor época fue la última.</w:t>
       </w:r>
     </w:p>
     <w:p>
@@ -874,7 +885,7 @@
                 <w:sz w:val="16"/>
                 <w:lang w:val="es-ES"/>
               </w:rPr>
-              <w:t>pendiente</w:t>
+              <w:t>93,9 ± 0,3</w:t>
             </w:r>
           </w:p>
         </w:tc>
@@ -893,7 +904,7 @@
                 <w:sz w:val="16"/>
                 <w:lang w:val="es-ES"/>
               </w:rPr>
-              <w:t>pendiente</w:t>
+              <w:t>98,2 ± 0,4</w:t>
             </w:r>
           </w:p>
         </w:tc>
@@ -933,7 +944,7 @@
                 <w:sz w:val="16"/>
                 <w:lang w:val="es-ES"/>
               </w:rPr>
-              <w:t>pendiente</w:t>
+              <w:t>93,7 ± 0,3</w:t>
             </w:r>
           </w:p>
         </w:tc>
@@ -952,7 +963,7 @@
                 <w:sz w:val="16"/>
                 <w:lang w:val="es-ES"/>
               </w:rPr>
-              <w:t>pendiente</w:t>
+              <w:t>98,2 ± 0,4</w:t>
             </w:r>
           </w:p>
         </w:tc>
@@ -992,7 +1003,7 @@
                 <w:sz w:val="16"/>
                 <w:lang w:val="es-ES"/>
               </w:rPr>
-              <w:t>pendiente</w:t>
+              <w:t>87,2 ± 4,7</w:t>
             </w:r>
           </w:p>
         </w:tc>
@@ -1011,7 +1022,7 @@
                 <w:sz w:val="16"/>
                 <w:lang w:val="es-ES"/>
               </w:rPr>
-              <w:t>pendiente</w:t>
+              <w:t>97,9 ± 1,8</w:t>
             </w:r>
           </w:p>
         </w:tc>
@@ -1051,7 +1062,7 @@
                 <w:sz w:val="16"/>
                 <w:lang w:val="es-ES"/>
               </w:rPr>
-              <w:t>pendiente</w:t>
+              <w:t>96,7 ± 0,2</w:t>
             </w:r>
           </w:p>
         </w:tc>
@@ -1070,7 +1081,7 @@
                 <w:sz w:val="16"/>
                 <w:lang w:val="es-ES"/>
               </w:rPr>
-              <w:t>pendiente</w:t>
+              <w:t>98,4 ± 0,4</w:t>
             </w:r>
           </w:p>
         </w:tc>
@@ -1110,7 +1121,7 @@
                 <w:sz w:val="16"/>
                 <w:lang w:val="es-ES"/>
               </w:rPr>
-              <w:t>pendiente</w:t>
+              <w:t>92,8 ± 3,3</w:t>
             </w:r>
           </w:p>
         </w:tc>
@@ -1129,7 +1140,7 @@
                 <w:sz w:val="16"/>
                 <w:lang w:val="es-ES"/>
               </w:rPr>
-              <w:t>pendiente</w:t>
+              <w:t>97,2 ± 1,8</w:t>
             </w:r>
           </w:p>
         </w:tc>
@@ -1169,7 +1180,7 @@
                 <w:sz w:val="16"/>
                 <w:lang w:val="es-ES"/>
               </w:rPr>
-              <w:t>pendiente</w:t>
+              <w:t>98,3 ± 0,6</w:t>
             </w:r>
           </w:p>
         </w:tc>
@@ -1188,7 +1199,7 @@
                 <w:sz w:val="16"/>
                 <w:lang w:val="es-ES"/>
               </w:rPr>
-              <w:t>pendiente</w:t>
+              <w:t>99,1 ± 0,2</w:t>
             </w:r>
           </w:p>
         </w:tc>
@@ -1228,7 +1239,7 @@
                 <w:sz w:val="16"/>
                 <w:lang w:val="es-ES"/>
               </w:rPr>
-              <w:t>pendiente</w:t>
+              <w:t>1,15 M</w:t>
             </w:r>
           </w:p>
         </w:tc>
@@ -1247,7 +1258,7 @@
                 <w:sz w:val="16"/>
                 <w:lang w:val="es-ES"/>
               </w:rPr>
-              <w:t>pendiente</w:t>
+              <w:t>11,18 M</w:t>
             </w:r>
           </w:p>
         </w:tc>
@@ -1287,7 +1298,7 @@
                 <w:sz w:val="16"/>
                 <w:lang w:val="es-ES"/>
               </w:rPr>
-              <w:t>pendiente</w:t>
+              <w:t>15 (12, 15, 15)</w:t>
             </w:r>
           </w:p>
         </w:tc>
@@ -1306,7 +1317,7 @@
                 <w:sz w:val="16"/>
                 <w:lang w:val="es-ES"/>
               </w:rPr>
-              <w:t>pendiente</w:t>
+              <w:t>6 (4, 4, 4)</w:t>
             </w:r>
           </w:p>
         </w:tc>
@@ -1327,7 +1338,7 @@
                 <w:sz w:val="16"/>
                 <w:lang w:val="es-ES"/>
               </w:rPr>
-              <w:t>Tiempo por entrenamiento (min)</w:t>
+              <w:t>Minutos por entrenamiento</w:t>
             </w:r>
           </w:p>
         </w:tc>
@@ -1346,7 +1357,7 @@
                 <w:sz w:val="16"/>
                 <w:lang w:val="es-ES"/>
               </w:rPr>
-              <w:t>pendiente</w:t>
+              <w:t>12,8</w:t>
             </w:r>
           </w:p>
         </w:tc>
@@ -1365,7 +1376,7 @@
                 <w:sz w:val="16"/>
                 <w:lang w:val="es-ES"/>
               </w:rPr>
-              <w:t>pendiente</w:t>
+              <w:t>9,7</w:t>
             </w:r>
           </w:p>
         </w:tc>
@@ -1379,18 +1390,50 @@
     </w:p>
     <w:p>
       <w:pPr>
-        <w:pStyle w:val="Text"/>
-      </w:pPr>
-      <w:r>
-        <w:rPr>
-          <w:lang w:val="es-ES"/>
-        </w:rPr>
-        <w:t>[Figura pendiente: curvas_entrenamiento.png]</w:t>
+        <w:pStyle w:val="Caption"/>
+        <w:keepNext/>
+        <w:spacing w:before="80"/>
+        <w:jc w:val="center"/>
+      </w:pPr>
+      <w:r>
+        <w:drawing>
+          <wp:inline xmlns:a="http://schemas.openxmlformats.org/drawingml/2006/main" xmlns:pic="http://schemas.openxmlformats.org/drawingml/2006/picture">
+            <wp:extent cx="2788920" cy="1584203"/>
+            <wp:docPr id="20" name="Picture 20"/>
+            <wp:cNvGraphicFramePr>
+              <a:graphicFrameLocks noChangeAspect="1"/>
+            </wp:cNvGraphicFramePr>
+            <a:graphic>
+              <a:graphicData uri="http://schemas.openxmlformats.org/drawingml/2006/picture">
+                <pic:pic>
+                  <pic:nvPicPr>
+                    <pic:cNvPr id="0" name="curvas_entrenamiento.png"/>
+                    <pic:cNvPicPr/>
+                  </pic:nvPicPr>
+                  <pic:blipFill>
+                    <a:blip r:embed="rId16"/>
+                    <a:stretch>
+                      <a:fillRect/>
+                    </a:stretch>
+                  </pic:blipFill>
+                  <pic:spPr>
+                    <a:xfrm>
+                      <a:off x="0" y="0"/>
+                      <a:ext cx="2788920" cy="1584203"/>
+                    </a:xfrm>
+                    <a:prstGeom prst="rect"/>
+                  </pic:spPr>
+                </pic:pic>
+              </a:graphicData>
+            </a:graphic>
+          </wp:inline>
+        </w:drawing>
       </w:r>
     </w:p>
     <w:p>
       <w:pPr>
         <w:pStyle w:val="Caption"/>
+        <w:spacing w:after="120"/>
         <w:jc w:val="both"/>
       </w:pPr>
       <w:r>
@@ -1417,12 +1460,55 @@
         <w:rPr>
           <w:lang w:val="es-ES"/>
         </w:rPr>
-        <w:t>[Figura pendiente: matrices_confusion.png]</w:t>
+        <w:t>En la Fig. 2, el error más frecuente de la CNN propia es clasificar un glioma como meningioma (25 de 243 gliomas en la semilla 0 y 88 de 729 en las tres semillas). ResNet18 lo reduce a 2 casos (14 en total), y 12 de sus 13 errores en la semilla 0 involucran al meningioma.</w:t>
       </w:r>
     </w:p>
     <w:p>
       <w:pPr>
         <w:pStyle w:val="Caption"/>
+        <w:keepNext/>
+        <w:spacing w:before="80"/>
+        <w:jc w:val="center"/>
+      </w:pPr>
+      <w:r>
+        <w:drawing>
+          <wp:inline xmlns:a="http://schemas.openxmlformats.org/drawingml/2006/main" xmlns:pic="http://schemas.openxmlformats.org/drawingml/2006/picture">
+            <wp:extent cx="2788920" cy="1663646"/>
+            <wp:docPr id="21" name="Picture 21"/>
+            <wp:cNvGraphicFramePr>
+              <a:graphicFrameLocks noChangeAspect="1"/>
+            </wp:cNvGraphicFramePr>
+            <a:graphic>
+              <a:graphicData uri="http://schemas.openxmlformats.org/drawingml/2006/picture">
+                <pic:pic>
+                  <pic:nvPicPr>
+                    <pic:cNvPr id="0" name="matrices_confusion.png"/>
+                    <pic:cNvPicPr/>
+                  </pic:nvPicPr>
+                  <pic:blipFill>
+                    <a:blip r:embed="rId17"/>
+                    <a:stretch>
+                      <a:fillRect/>
+                    </a:stretch>
+                  </pic:blipFill>
+                  <pic:spPr>
+                    <a:xfrm>
+                      <a:off x="0" y="0"/>
+                      <a:ext cx="2788920" cy="1663646"/>
+                    </a:xfrm>
+                    <a:prstGeom prst="rect"/>
+                  </pic:spPr>
+                </pic:pic>
+              </a:graphicData>
+            </a:graphic>
+          </wp:inline>
+        </w:drawing>
+      </w:r>
+    </w:p>
+    <w:p>
+      <w:pPr>
+        <w:pStyle w:val="Caption"/>
+        <w:spacing w:after="120"/>
         <w:jc w:val="both"/>
       </w:pPr>
       <w:r>
@@ -1449,12 +1535,55 @@
         <w:rPr>
           <w:lang w:val="es-ES"/>
         </w:rPr>
-        <w:t>[Figura pendiente: ejemplos_predicciones.png]</w:t>
+        <w:t>En la Fig. 3, la CNN propia confunde con meningioma un corte sano y un glioma heterogéneo que ResNet18 clasifica bien. Los otros dos errores son tumores de la región selar: un meningioma que la CNN toma por tumor pituitario y un tumor pituitario que ambos modelos llaman meningioma.</w:t>
       </w:r>
     </w:p>
     <w:p>
       <w:pPr>
         <w:pStyle w:val="Caption"/>
+        <w:keepNext/>
+        <w:spacing w:before="80"/>
+        <w:jc w:val="center"/>
+      </w:pPr>
+      <w:r>
+        <w:drawing>
+          <wp:inline xmlns:a="http://schemas.openxmlformats.org/drawingml/2006/main" xmlns:pic="http://schemas.openxmlformats.org/drawingml/2006/picture">
+            <wp:extent cx="2788920" cy="2046335"/>
+            <wp:docPr id="22" name="Picture 22"/>
+            <wp:cNvGraphicFramePr>
+              <a:graphicFrameLocks noChangeAspect="1"/>
+            </wp:cNvGraphicFramePr>
+            <a:graphic>
+              <a:graphicData uri="http://schemas.openxmlformats.org/drawingml/2006/picture">
+                <pic:pic>
+                  <pic:nvPicPr>
+                    <pic:cNvPr id="0" name="ejemplos_predicciones.png"/>
+                    <pic:cNvPicPr/>
+                  </pic:nvPicPr>
+                  <pic:blipFill>
+                    <a:blip r:embed="rId18"/>
+                    <a:stretch>
+                      <a:fillRect/>
+                    </a:stretch>
+                  </pic:blipFill>
+                  <pic:spPr>
+                    <a:xfrm>
+                      <a:off x="0" y="0"/>
+                      <a:ext cx="2788920" cy="2046335"/>
+                    </a:xfrm>
+                    <a:prstGeom prst="rect"/>
+                  </pic:spPr>
+                </pic:pic>
+              </a:graphicData>
+            </a:graphic>
+          </wp:inline>
+        </w:drawing>
+      </w:r>
+    </w:p>
+    <w:p>
+      <w:pPr>
+        <w:pStyle w:val="Caption"/>
+        <w:spacing w:after="120"/>
         <w:jc w:val="both"/>
       </w:pPr>
       <w:r>
@@ -1507,7 +1636,79 @@
         <w:rPr>
           <w:lang w:val="es-ES"/>
         </w:rPr>
-        <w:t>[Pendiente: se completa con el análisis de los resultados finales.]</w:t>
+        <w:t xml:space="preserve">La ventaja de ResNet18 viene de la transferencia de aprendizaje: sus filtros de ImageNet ya responden a bordes y texturas, y el </w:t>
+      </w:r>
+      <w:r>
+        <w:rPr>
+          <w:i/>
+          <w:lang w:val="es-ES"/>
+        </w:rPr>
+        <w:t>fine-tuning</w:t>
+      </w:r>
+      <w:r>
+        <w:rPr>
+          <w:lang w:val="es-ES"/>
+        </w:rPr>
+        <w:t xml:space="preserve"> solo los adapta a la MRI. Por eso converge en 4 épocas y entrena en menos tiempo (9,7 frente a 12,8 minutos). La CNN propia aprende esos filtros desde cero con 4617 imágenes y está en subajuste: su exactitud de entrenamiento, medida con </w:t>
+      </w:r>
+      <w:r>
+        <w:rPr>
+          <w:i/>
+          <w:lang w:val="es-ES"/>
+        </w:rPr>
+        <w:t>dropout</w:t>
+      </w:r>
+      <w:r>
+        <w:rPr>
+          <w:lang w:val="es-ES"/>
+        </w:rPr>
+        <w:t xml:space="preserve"> activo y volteos, no supera a la de validación, y seguía mejorando en la última época. ResNet18 sí abre una brecha pequeña (99 % en entrenamiento y 98 % en validación), que se controla guardando la mejor época.</w:t>
+      </w:r>
+    </w:p>
+    <w:p>
+      <w:pPr>
+        <w:pStyle w:val="Text"/>
+      </w:pPr>
+      <w:r>
+        <w:rPr>
+          <w:lang w:val="es-ES"/>
+        </w:rPr>
+        <w:t>La confusión entre glioma y meningioma tiene una explicación visual: ambos pueden verse como masas brillantes en T1 con contraste, y en un solo corte no siempre se distingue si la lesión nace del cerebro o de las meninges. En la región selar, la localización, que es la pista principal del tumor pituitario, la comparten los meningiomas de esa zona.</w:t>
+      </w:r>
+    </w:p>
+    <w:p>
+      <w:pPr>
+        <w:pStyle w:val="Text"/>
+      </w:pPr>
+      <w:r>
+        <w:rPr>
+          <w:lang w:val="es-ES"/>
+        </w:rPr>
+        <w:t>Hay limitaciones que pueden inflar las métricas. La división es por imagen y no por paciente, porque el conjunto no trae esa información, así que cortes vecinos de un mismo paciente pueden quedar en entrenamiento y en prueba sin que el hash MD5 los detecte. Además, las imágenes sanas vienen de otra fuente (solo el 1 % mide 512×512, frente al 100 % de los gliomas) y el modelo podría reconocer la fuente en lugar de la ausencia de tumor. Por último, todo se midió sobre una sola división de datos.</w:t>
+      </w:r>
+    </w:p>
+    <w:p>
+      <w:pPr>
+        <w:pStyle w:val="Text"/>
+      </w:pPr>
+      <w:r>
+        <w:rPr>
+          <w:lang w:val="es-ES"/>
+        </w:rPr>
+        <w:t xml:space="preserve">Como mejoras se propone dividir por paciente cuando haya esa información, evaluar con imágenes de otro hospital y usar mapas de activación como Grad-CAM para comprobar si la red mira el tumor o señales de la fuente. La CNN propia necesita más épocas con una tasa de aprendizaje decreciente. Con los datos actuales se recomienda ResNet18 con </w:t>
+      </w:r>
+      <w:r>
+        <w:rPr>
+          <w:i/>
+          <w:lang w:val="es-ES"/>
+        </w:rPr>
+        <w:t>fine-tuning</w:t>
+      </w:r>
+      <w:r>
+        <w:rPr>
+          <w:lang w:val="es-ES"/>
+        </w:rPr>
+        <w:t>.</w:t>
       </w:r>
     </w:p>
     <w:sectPr>

</xml_diff>